<commit_message>
Prepare final Cancers reproducibility release
</commit_message>
<xml_diff>
--- a/cancers_submission_2026/supplementary_material/Supplementary_Material_Cancers.docx
+++ b/cancers_submission_2026/supplementary_material/Supplementary_Material_Cancers.docx
@@ -34,7 +34,7 @@
           <w:color w:val="404040"/>
           <w:sz w:val="19"/>
         </w:rPr>
-        <w:t>Supplementary Figures S1–S16 and Supplementary Tables S1–S25. The tables are supplied as a separate workbook, Supplementary_Tables_Cancers.xlsx, whose README sheet repeats the index below and whose Crosswalk sheet maps every item of the previous version onto this one.</w:t>
+        <w:t>Supplementary Figures S1–S15 and Supplementary Tables S1–S25. The tables are supplied as a separate workbook, Supplementary_Tables_Cancers.xlsx, whose README sheet repeats the index below.</w:t>
       </w:r>
     </w:p>
     <w:p>
@@ -128,14 +128,10 @@
       <w:r>
         <w:rPr>
           <w:b/>
-          <w:sz w:val="19"/>
         </w:rPr>
         <w:t xml:space="preserve">Figure S5. </w:t>
       </w:r>
       <w:r>
-        <w:rPr>
-          <w:sz w:val="19"/>
-        </w:rPr>
         <w:t>Clustering-definition and held-out-feature sensitivity.</w:t>
       </w:r>
     </w:p>
@@ -154,7 +150,7 @@
         <w:rPr>
           <w:sz w:val="19"/>
         </w:rPr>
-        <w:t>PERMANOVA variance partition, immune ecotype versus integrated molecular group.</w:t>
+        <w:t>Immune-theme composites across the ecotypes.</w:t>
       </w:r>
     </w:p>
     <w:p>
@@ -172,7 +168,7 @@
         <w:rPr>
           <w:sz w:val="19"/>
         </w:rPr>
-        <w:t>Immune-theme composites across the ecotypes.</w:t>
+        <w:t>Per-signature immune programs and post-hoc comparisons.</w:t>
       </w:r>
     </w:p>
     <w:p>
@@ -190,7 +186,7 @@
         <w:rPr>
           <w:sz w:val="19"/>
         </w:rPr>
-        <w:t>Per-signature immune programs and post-hoc comparisons.</w:t>
+        <w:t>Pathway enrichment from the molecular-group-adjusted gene lists.</w:t>
       </w:r>
     </w:p>
     <w:p>
@@ -208,7 +204,7 @@
         <w:rPr>
           <w:sz w:val="19"/>
         </w:rPr>
-        <w:t>Pathway enrichment from the molecular-group-adjusted gene lists.</w:t>
+        <w:t>Unadjusted one-versus-rest differential expression.</w:t>
       </w:r>
     </w:p>
     <w:p>
@@ -226,7 +222,7 @@
         <w:rPr>
           <w:sz w:val="19"/>
         </w:rPr>
-        <w:t>Unadjusted one-versus-rest differential expression.</w:t>
+        <w:t>Subtype-stratified survival.</w:t>
       </w:r>
     </w:p>
     <w:p>
@@ -244,7 +240,7 @@
         <w:rPr>
           <w:sz w:val="19"/>
         </w:rPr>
-        <w:t>Subtype-stratified survival.</w:t>
+        <w:t>Location-stratified Kaplan–Meier curves.</w:t>
       </w:r>
     </w:p>
     <w:p>
@@ -262,7 +258,7 @@
         <w:rPr>
           <w:sz w:val="19"/>
         </w:rPr>
-        <w:t>Location-stratified Kaplan–Meier curves.</w:t>
+        <w:t>Proportional-hazards diagnostics.</w:t>
       </w:r>
     </w:p>
     <w:p>
@@ -280,7 +276,7 @@
         <w:rPr>
           <w:sz w:val="19"/>
         </w:rPr>
-        <w:t>Proportional-hazards diagnostics.</w:t>
+        <w:t>Survival missingness and inverse-probability-weighting sensitivity.</w:t>
       </w:r>
     </w:p>
     <w:p>
@@ -298,7 +294,7 @@
         <w:rPr>
           <w:sz w:val="19"/>
         </w:rPr>
-        <w:t>Survival missingness and inverse-probability-weighting sensitivity.</w:t>
+        <w:t>Single-cell support for the cellular interpretation of the immune signatures and of the ecotype axis, full analysis.</w:t>
       </w:r>
     </w:p>
     <w:p>
@@ -311,24 +307,6 @@
           <w:sz w:val="19"/>
         </w:rPr>
         <w:t xml:space="preserve">Figure S15. </w:t>
-      </w:r>
-      <w:r>
-        <w:rPr>
-          <w:sz w:val="19"/>
-        </w:rPr>
-        <w:t>Single-cell support for the cellular interpretation of the immune signatures and of the ecotype axis, full analysis.</w:t>
-      </w:r>
-    </w:p>
-    <w:p>
-      <w:pPr>
-        <w:spacing w:after="20"/>
-      </w:pPr>
-      <w:r>
-        <w:rPr>
-          <w:b/>
-          <w:sz w:val="19"/>
-        </w:rPr>
-        <w:t xml:space="preserve">Figure S16. </w:t>
       </w:r>
       <w:r>
         <w:rPr>
@@ -788,9 +766,7 @@
       </w:r>
     </w:p>
     <w:p>
-      <w:r>
-        <w:br w:type="page"/>
-      </w:r>
+      <w:r/>
     </w:p>
     <w:p>
       <w:pPr>
@@ -809,40 +785,7 @@
         <w:spacing w:after="120"/>
         <w:jc w:val="center"/>
       </w:pPr>
-      <w:r>
-        <w:drawing>
-          <wp:inline xmlns:a="http://schemas.openxmlformats.org/drawingml/2006/main" xmlns:pic="http://schemas.openxmlformats.org/drawingml/2006/picture">
-            <wp:extent cx="5852160" cy="3429000"/>
-            <wp:docPr id="1" name="Picture 1"/>
-            <wp:cNvGraphicFramePr>
-              <a:graphicFrameLocks noChangeAspect="1"/>
-            </wp:cNvGraphicFramePr>
-            <a:graphic>
-              <a:graphicData uri="http://schemas.openxmlformats.org/drawingml/2006/picture">
-                <pic:pic>
-                  <pic:nvPicPr>
-                    <pic:cNvPr id="0" name="S1.png"/>
-                    <pic:cNvPicPr/>
-                  </pic:nvPicPr>
-                  <pic:blipFill>
-                    <a:blip r:embed="rId9"/>
-                    <a:stretch>
-                      <a:fillRect/>
-                    </a:stretch>
-                  </pic:blipFill>
-                  <pic:spPr>
-                    <a:xfrm>
-                      <a:off x="0" y="0"/>
-                      <a:ext cx="5852160" cy="3429000"/>
-                    </a:xfrm>
-                    <a:prstGeom prst="rect"/>
-                  </pic:spPr>
-                </pic:pic>
-              </a:graphicData>
-            </a:graphic>
-          </wp:inline>
-        </w:drawing>
-      </w:r>
+      <w:r/>
     </w:p>
     <w:p>
       <w:pPr>
@@ -865,49 +808,14 @@
       </w:r>
     </w:p>
     <w:p>
-      <w:r>
-        <w:br w:type="page"/>
-      </w:r>
+      <w:r/>
     </w:p>
     <w:p>
       <w:pPr>
         <w:spacing w:after="120"/>
         <w:jc w:val="center"/>
       </w:pPr>
-      <w:r>
-        <w:drawing>
-          <wp:inline xmlns:a="http://schemas.openxmlformats.org/drawingml/2006/main" xmlns:pic="http://schemas.openxmlformats.org/drawingml/2006/picture">
-            <wp:extent cx="5852160" cy="1723644"/>
-            <wp:docPr id="2" name="Picture 2"/>
-            <wp:cNvGraphicFramePr>
-              <a:graphicFrameLocks noChangeAspect="1"/>
-            </wp:cNvGraphicFramePr>
-            <a:graphic>
-              <a:graphicData uri="http://schemas.openxmlformats.org/drawingml/2006/picture">
-                <pic:pic>
-                  <pic:nvPicPr>
-                    <pic:cNvPr id="0" name="S2.png"/>
-                    <pic:cNvPicPr/>
-                  </pic:nvPicPr>
-                  <pic:blipFill>
-                    <a:blip r:embed="rId10"/>
-                    <a:stretch>
-                      <a:fillRect/>
-                    </a:stretch>
-                  </pic:blipFill>
-                  <pic:spPr>
-                    <a:xfrm>
-                      <a:off x="0" y="0"/>
-                      <a:ext cx="5852160" cy="1723644"/>
-                    </a:xfrm>
-                    <a:prstGeom prst="rect"/>
-                  </pic:spPr>
-                </pic:pic>
-              </a:graphicData>
-            </a:graphic>
-          </wp:inline>
-        </w:drawing>
-      </w:r>
+      <w:r/>
     </w:p>
     <w:p>
       <w:pPr>
@@ -930,49 +838,14 @@
       </w:r>
     </w:p>
     <w:p>
-      <w:r>
-        <w:br w:type="page"/>
-      </w:r>
+      <w:r/>
     </w:p>
     <w:p>
       <w:pPr>
         <w:spacing w:after="120"/>
         <w:jc w:val="center"/>
       </w:pPr>
-      <w:r>
-        <w:drawing>
-          <wp:inline xmlns:a="http://schemas.openxmlformats.org/drawingml/2006/main" xmlns:pic="http://schemas.openxmlformats.org/drawingml/2006/picture">
-            <wp:extent cx="5852160" cy="4786884"/>
-            <wp:docPr id="3" name="Picture 3"/>
-            <wp:cNvGraphicFramePr>
-              <a:graphicFrameLocks noChangeAspect="1"/>
-            </wp:cNvGraphicFramePr>
-            <a:graphic>
-              <a:graphicData uri="http://schemas.openxmlformats.org/drawingml/2006/picture">
-                <pic:pic>
-                  <pic:nvPicPr>
-                    <pic:cNvPr id="0" name="S3.png"/>
-                    <pic:cNvPicPr/>
-                  </pic:nvPicPr>
-                  <pic:blipFill>
-                    <a:blip r:embed="rId11"/>
-                    <a:stretch>
-                      <a:fillRect/>
-                    </a:stretch>
-                  </pic:blipFill>
-                  <pic:spPr>
-                    <a:xfrm>
-                      <a:off x="0" y="0"/>
-                      <a:ext cx="5852160" cy="4786884"/>
-                    </a:xfrm>
-                    <a:prstGeom prst="rect"/>
-                  </pic:spPr>
-                </pic:pic>
-              </a:graphicData>
-            </a:graphic>
-          </wp:inline>
-        </w:drawing>
-      </w:r>
+      <w:r/>
     </w:p>
     <w:p>
       <w:pPr>
@@ -995,49 +868,14 @@
       </w:r>
     </w:p>
     <w:p>
-      <w:r>
-        <w:br w:type="page"/>
-      </w:r>
+      <w:r/>
     </w:p>
     <w:p>
       <w:pPr>
         <w:spacing w:after="120"/>
         <w:jc w:val="center"/>
       </w:pPr>
-      <w:r>
-        <w:drawing>
-          <wp:inline xmlns:a="http://schemas.openxmlformats.org/drawingml/2006/main" xmlns:pic="http://schemas.openxmlformats.org/drawingml/2006/picture">
-            <wp:extent cx="5852160" cy="1833372"/>
-            <wp:docPr id="4" name="Picture 4"/>
-            <wp:cNvGraphicFramePr>
-              <a:graphicFrameLocks noChangeAspect="1"/>
-            </wp:cNvGraphicFramePr>
-            <a:graphic>
-              <a:graphicData uri="http://schemas.openxmlformats.org/drawingml/2006/picture">
-                <pic:pic>
-                  <pic:nvPicPr>
-                    <pic:cNvPr id="0" name="S4.png"/>
-                    <pic:cNvPicPr/>
-                  </pic:nvPicPr>
-                  <pic:blipFill>
-                    <a:blip r:embed="rId12"/>
-                    <a:stretch>
-                      <a:fillRect/>
-                    </a:stretch>
-                  </pic:blipFill>
-                  <pic:spPr>
-                    <a:xfrm>
-                      <a:off x="0" y="0"/>
-                      <a:ext cx="5852160" cy="1833372"/>
-                    </a:xfrm>
-                    <a:prstGeom prst="rect"/>
-                  </pic:spPr>
-                </pic:pic>
-              </a:graphicData>
-            </a:graphic>
-          </wp:inline>
-        </w:drawing>
-      </w:r>
+      <w:r/>
     </w:p>
     <w:p>
       <w:pPr>
@@ -1060,49 +898,14 @@
       </w:r>
     </w:p>
     <w:p>
-      <w:r>
-        <w:br w:type="page"/>
-      </w:r>
+      <w:r/>
     </w:p>
     <w:p>
       <w:pPr>
         <w:spacing w:after="120"/>
         <w:jc w:val="center"/>
       </w:pPr>
-      <w:r>
-        <w:drawing>
-          <wp:inline xmlns:a="http://schemas.openxmlformats.org/drawingml/2006/main" xmlns:pic="http://schemas.openxmlformats.org/drawingml/2006/picture">
-            <wp:extent cx="5852160" cy="1421892"/>
-            <wp:docPr id="5" name="Picture 5"/>
-            <wp:cNvGraphicFramePr>
-              <a:graphicFrameLocks noChangeAspect="1"/>
-            </wp:cNvGraphicFramePr>
-            <a:graphic>
-              <a:graphicData uri="http://schemas.openxmlformats.org/drawingml/2006/picture">
-                <pic:pic>
-                  <pic:nvPicPr>
-                    <pic:cNvPr id="0" name="S5.png"/>
-                    <pic:cNvPicPr/>
-                  </pic:nvPicPr>
-                  <pic:blipFill>
-                    <a:blip r:embed="rId13"/>
-                    <a:stretch>
-                      <a:fillRect/>
-                    </a:stretch>
-                  </pic:blipFill>
-                  <pic:spPr>
-                    <a:xfrm>
-                      <a:off x="0" y="0"/>
-                      <a:ext cx="5852160" cy="1421892"/>
-                    </a:xfrm>
-                    <a:prstGeom prst="rect"/>
-                  </pic:spPr>
-                </pic:pic>
-              </a:graphicData>
-            </a:graphic>
-          </wp:inline>
-        </w:drawing>
-      </w:r>
+      <w:r/>
     </w:p>
     <w:p>
       <w:pPr>
@@ -1121,53 +924,21 @@
         <w:t xml:space="preserve">Clustering-definition and held-out-feature sensitivity. </w:t>
       </w:r>
       <w:r>
-        <w:t>Cluster-number metrics on the 46-feature matrix; feature-block sensitivity; circular versus held-out PERMANOVA; and the de novo 34-feature TPM-harmonized confusion matrix against the locked assignment. These panels indicate partial feature-definition stability, not validation of a finalized classifier. Statistics are in Supplementary Tables S9 and S10.</w:t>
+        <w:t>Cluster-number metrics on the 46-feature matrix; feature-block sensitivity; and the de novo 34-feature TPM-harmonized confusion matrix against the locked assignment. These panels indicate partial feature-definition stability, not validation of a finalized classifier. Statistics are in Supplementary Tables S9 and S10.</w:t>
       </w:r>
     </w:p>
     <w:p>
-      <w:r>
-        <w:br w:type="page"/>
-      </w:r>
+      <w:r/>
+    </w:p>
+    <w:p>
+      <w:r/>
     </w:p>
     <w:p>
       <w:pPr>
         <w:spacing w:after="120"/>
         <w:jc w:val="center"/>
       </w:pPr>
-      <w:r>
-        <w:drawing>
-          <wp:inline xmlns:a="http://schemas.openxmlformats.org/drawingml/2006/main" xmlns:pic="http://schemas.openxmlformats.org/drawingml/2006/picture">
-            <wp:extent cx="5852160" cy="3575304"/>
-            <wp:docPr id="6" name="Picture 6"/>
-            <wp:cNvGraphicFramePr>
-              <a:graphicFrameLocks noChangeAspect="1"/>
-            </wp:cNvGraphicFramePr>
-            <a:graphic>
-              <a:graphicData uri="http://schemas.openxmlformats.org/drawingml/2006/picture">
-                <pic:pic>
-                  <pic:nvPicPr>
-                    <pic:cNvPr id="0" name="S6.png"/>
-                    <pic:cNvPicPr/>
-                  </pic:nvPicPr>
-                  <pic:blipFill>
-                    <a:blip r:embed="rId14"/>
-                    <a:stretch>
-                      <a:fillRect/>
-                    </a:stretch>
-                  </pic:blipFill>
-                  <pic:spPr>
-                    <a:xfrm>
-                      <a:off x="0" y="0"/>
-                      <a:ext cx="5852160" cy="3575304"/>
-                    </a:xfrm>
-                    <a:prstGeom prst="rect"/>
-                  </pic:spPr>
-                </pic:pic>
-              </a:graphicData>
-            </a:graphic>
-          </wp:inline>
-        </w:drawing>
-      </w:r>
+      <w:r/>
     </w:p>
     <w:p>
       <w:pPr>
@@ -1183,56 +954,21 @@
         <w:rPr>
           <w:b/>
         </w:rPr>
-        <w:t xml:space="preserve">PERMANOVA variance partition, immune ecotype versus integrated molecular group. </w:t>
+        <w:t xml:space="preserve">Immune-theme composites across the ecotypes. </w:t>
       </w:r>
       <w:r>
-        <w:t>Computed on the 34-feature TPM-harmonized matrix (Euclidean distance, 4,999 permutations). Ecotype entered first explained R² = 0.3206 (P = 0.0002) and molecular group after ecotype R² = 0.0168 (P = 0.0014); with molecular group entered first, ecotype retained R² = 0.2940 (P = 0.0002).</w:t>
+        <w:t>(A) Five immune-theme composites calculated from per-signature z-scores. (B) The same composites stratified by integrated molecular group; within-group Kruskal–Wallis tests are Benjamini–Hochberg adjusted, but the DHG, H3 G34-mutant and infant-type hemispheric panels are descriptive because of sparse ecotype strata. Statistics are in Supplementary Table S14.</w:t>
       </w:r>
     </w:p>
     <w:p>
-      <w:r>
-        <w:br w:type="page"/>
-      </w:r>
+      <w:r/>
     </w:p>
     <w:p>
       <w:pPr>
         <w:spacing w:after="120"/>
         <w:jc w:val="center"/>
       </w:pPr>
-      <w:r>
-        <w:drawing>
-          <wp:inline xmlns:a="http://schemas.openxmlformats.org/drawingml/2006/main" xmlns:pic="http://schemas.openxmlformats.org/drawingml/2006/picture">
-            <wp:extent cx="5852160" cy="3337560"/>
-            <wp:docPr id="7" name="Picture 7"/>
-            <wp:cNvGraphicFramePr>
-              <a:graphicFrameLocks noChangeAspect="1"/>
-            </wp:cNvGraphicFramePr>
-            <a:graphic>
-              <a:graphicData uri="http://schemas.openxmlformats.org/drawingml/2006/picture">
-                <pic:pic>
-                  <pic:nvPicPr>
-                    <pic:cNvPr id="0" name="S7.png"/>
-                    <pic:cNvPicPr/>
-                  </pic:nvPicPr>
-                  <pic:blipFill>
-                    <a:blip r:embed="rId15"/>
-                    <a:stretch>
-                      <a:fillRect/>
-                    </a:stretch>
-                  </pic:blipFill>
-                  <pic:spPr>
-                    <a:xfrm>
-                      <a:off x="0" y="0"/>
-                      <a:ext cx="5852160" cy="3337560"/>
-                    </a:xfrm>
-                    <a:prstGeom prst="rect"/>
-                  </pic:spPr>
-                </pic:pic>
-              </a:graphicData>
-            </a:graphic>
-          </wp:inline>
-        </w:drawing>
-      </w:r>
+      <w:r/>
     </w:p>
     <w:p>
       <w:pPr>
@@ -1248,56 +984,21 @@
         <w:rPr>
           <w:b/>
         </w:rPr>
-        <w:t xml:space="preserve">Immune-theme composites across the ecotypes. </w:t>
+        <w:t xml:space="preserve">Per-signature immune programs and post-hoc comparisons. </w:t>
       </w:r>
       <w:r>
-        <w:t>(A) Five immune-theme composites calculated from per-signature z-scores. (B) The same composites stratified by integrated molecular group; within-group Kruskal–Wallis tests are Benjamini–Hochberg adjusted, but the DHG, H3 G34-mutant and infant-type hemispheric panels are descriptive because of sparse ecotype strata. Statistics are in Supplementary Table S14.</w:t>
+        <w:t>(A) Mean per-signature z-score by ecotype for all 24 brain-tuned ssGSEA signatures. (B) Twelve focus signatures, ending with the interferon-γ response. (C) Dunn post-hoc signed −log₁₀(q) heatmap for the same twelve signatures; the color scale is capped at ±300 for readability. Statistics are in Supplementary Tables S14 and S15.</w:t>
       </w:r>
     </w:p>
     <w:p>
-      <w:r>
-        <w:br w:type="page"/>
-      </w:r>
+      <w:r/>
     </w:p>
     <w:p>
       <w:pPr>
         <w:spacing w:after="120"/>
         <w:jc w:val="center"/>
       </w:pPr>
-      <w:r>
-        <w:drawing>
-          <wp:inline xmlns:a="http://schemas.openxmlformats.org/drawingml/2006/main" xmlns:pic="http://schemas.openxmlformats.org/drawingml/2006/picture">
-            <wp:extent cx="5852160" cy="5550408"/>
-            <wp:docPr id="8" name="Picture 8"/>
-            <wp:cNvGraphicFramePr>
-              <a:graphicFrameLocks noChangeAspect="1"/>
-            </wp:cNvGraphicFramePr>
-            <a:graphic>
-              <a:graphicData uri="http://schemas.openxmlformats.org/drawingml/2006/picture">
-                <pic:pic>
-                  <pic:nvPicPr>
-                    <pic:cNvPr id="0" name="S8.png"/>
-                    <pic:cNvPicPr/>
-                  </pic:nvPicPr>
-                  <pic:blipFill>
-                    <a:blip r:embed="rId16"/>
-                    <a:stretch>
-                      <a:fillRect/>
-                    </a:stretch>
-                  </pic:blipFill>
-                  <pic:spPr>
-                    <a:xfrm>
-                      <a:off x="0" y="0"/>
-                      <a:ext cx="5852160" cy="5550408"/>
-                    </a:xfrm>
-                    <a:prstGeom prst="rect"/>
-                  </pic:spPr>
-                </pic:pic>
-              </a:graphicData>
-            </a:graphic>
-          </wp:inline>
-        </w:drawing>
-      </w:r>
+      <w:r/>
     </w:p>
     <w:p>
       <w:pPr>
@@ -1313,56 +1014,21 @@
         <w:rPr>
           <w:b/>
         </w:rPr>
-        <w:t xml:space="preserve">Per-signature immune programs and post-hoc comparisons. </w:t>
+        <w:t xml:space="preserve">Pathway enrichment from the molecular-group-adjusted gene lists. </w:t>
       </w:r>
       <w:r>
-        <w:t>(A) Mean per-signature z-score by ecotype for all 24 brain-tuned ssGSEA signatures. (B) Twelve focus signatures, ending with the interferon-γ response. (C) Dunn post-hoc signed −log₁₀(q) heatmap for the same twelve signatures; the color scale is capped at ±300 for readability. Statistics are in Supplementary Tables S14 and S15.</w:t>
+        <w:t>g:Profiler enrichment of the up-regulated gene lists of Figure 6A–C. Lymphocyte-inflamed and Myeloid-dominant show immune, defense-response and antigen-processing terms; no Immune-desert term passed the displayed adjusted criterion, so that panel is blank. Full results are in Supplementary Table S19.</w:t>
       </w:r>
     </w:p>
     <w:p>
-      <w:r>
-        <w:br w:type="page"/>
-      </w:r>
+      <w:r/>
     </w:p>
     <w:p>
       <w:pPr>
         <w:spacing w:after="120"/>
         <w:jc w:val="center"/>
       </w:pPr>
-      <w:r>
-        <w:drawing>
-          <wp:inline xmlns:a="http://schemas.openxmlformats.org/drawingml/2006/main" xmlns:pic="http://schemas.openxmlformats.org/drawingml/2006/picture">
-            <wp:extent cx="5852159" cy="2066544"/>
-            <wp:docPr id="9" name="Picture 9"/>
-            <wp:cNvGraphicFramePr>
-              <a:graphicFrameLocks noChangeAspect="1"/>
-            </wp:cNvGraphicFramePr>
-            <a:graphic>
-              <a:graphicData uri="http://schemas.openxmlformats.org/drawingml/2006/picture">
-                <pic:pic>
-                  <pic:nvPicPr>
-                    <pic:cNvPr id="0" name="S9.png"/>
-                    <pic:cNvPicPr/>
-                  </pic:nvPicPr>
-                  <pic:blipFill>
-                    <a:blip r:embed="rId17"/>
-                    <a:stretch>
-                      <a:fillRect/>
-                    </a:stretch>
-                  </pic:blipFill>
-                  <pic:spPr>
-                    <a:xfrm>
-                      <a:off x="0" y="0"/>
-                      <a:ext cx="5852159" cy="2066544"/>
-                    </a:xfrm>
-                    <a:prstGeom prst="rect"/>
-                  </pic:spPr>
-                </pic:pic>
-              </a:graphicData>
-            </a:graphic>
-          </wp:inline>
-        </w:drawing>
-      </w:r>
+      <w:r/>
     </w:p>
     <w:p>
       <w:pPr>
@@ -1378,56 +1044,21 @@
         <w:rPr>
           <w:b/>
         </w:rPr>
-        <w:t xml:space="preserve">Pathway enrichment from the molecular-group-adjusted gene lists. </w:t>
+        <w:t xml:space="preserve">Unadjusted one-versus-rest differential expression. </w:t>
       </w:r>
       <w:r>
-        <w:t>g:Profiler enrichment of the up-regulated gene lists of Figure 6A–C. Lymphocyte-inflamed and Myeloid-dominant show immune, defense-response and antigen-processing terms; no Immune-desert term passed the displayed adjusted criterion, so that panel is blank. Full results are in Supplementary Table S19.</w:t>
+        <w:t>Exploratory one-versus-rest analysis using two-sided tie-corrected asymptotic Mann–Whitney U tests with continuity correction and within-contrast Benjamini–Hochberg adjustment; the y-axis maxima are approximately 36, 5 and 27 for Lymphocyte-inflamed, Myeloid-dominant and Immune-desert. Figure 6A–C uses the molecular-group-adjusted models.</w:t>
       </w:r>
     </w:p>
     <w:p>
-      <w:r>
-        <w:br w:type="page"/>
-      </w:r>
+      <w:r/>
     </w:p>
     <w:p>
       <w:pPr>
         <w:spacing w:after="120"/>
         <w:jc w:val="center"/>
       </w:pPr>
-      <w:r>
-        <w:drawing>
-          <wp:inline xmlns:a="http://schemas.openxmlformats.org/drawingml/2006/main" xmlns:pic="http://schemas.openxmlformats.org/drawingml/2006/picture">
-            <wp:extent cx="5852160" cy="1810512"/>
-            <wp:docPr id="10" name="Picture 10"/>
-            <wp:cNvGraphicFramePr>
-              <a:graphicFrameLocks noChangeAspect="1"/>
-            </wp:cNvGraphicFramePr>
-            <a:graphic>
-              <a:graphicData uri="http://schemas.openxmlformats.org/drawingml/2006/picture">
-                <pic:pic>
-                  <pic:nvPicPr>
-                    <pic:cNvPr id="0" name="S10.png"/>
-                    <pic:cNvPicPr/>
-                  </pic:nvPicPr>
-                  <pic:blipFill>
-                    <a:blip r:embed="rId18"/>
-                    <a:stretch>
-                      <a:fillRect/>
-                    </a:stretch>
-                  </pic:blipFill>
-                  <pic:spPr>
-                    <a:xfrm>
-                      <a:off x="0" y="0"/>
-                      <a:ext cx="5852160" cy="1810512"/>
-                    </a:xfrm>
-                    <a:prstGeom prst="rect"/>
-                  </pic:spPr>
-                </pic:pic>
-              </a:graphicData>
-            </a:graphic>
-          </wp:inline>
-        </w:drawing>
-      </w:r>
+      <w:r/>
     </w:p>
     <w:p>
       <w:pPr>
@@ -1443,56 +1074,21 @@
         <w:rPr>
           <w:b/>
         </w:rPr>
-        <w:t xml:space="preserve">Unadjusted one-versus-rest differential expression. </w:t>
+        <w:t xml:space="preserve">Subtype-stratified survival. </w:t>
       </w:r>
       <w:r>
-        <w:t>Exploratory one-versus-rest analysis using two-sided tie-corrected asymptotic Mann–Whitney U tests with continuity correction and within-contrast Benjamini–Hochberg adjustment; the y-axis maxima are approximately 36, 5 and 27 for Lymphocyte-inflamed, Myeloid-dominant and Immune-desert. Figure 6A–C uses the molecular-group-adjusted models.</w:t>
+        <w:t>(A) Kaplan–Meier curves by ecotype in the two adequately sized strata: DMG, H3 K27-altered (n = 140, log-rank P = 0.140) and pediatric high-grade glioma, H3/IDH-wildtype (n = 82, P = 0.0612). (B) Within-subtype Cox hazard ratios for Immune-desert versus Lymphocyte-inflamed, with the interaction likelihood-ratio test. Strata with very small ecotype-specific sample and event counts are descriptive only and are not evidence of subtype generalizability. Model output is in Supplementary Table S20.</w:t>
       </w:r>
     </w:p>
     <w:p>
-      <w:r>
-        <w:br w:type="page"/>
-      </w:r>
+      <w:r/>
     </w:p>
     <w:p>
       <w:pPr>
         <w:spacing w:after="120"/>
         <w:jc w:val="center"/>
       </w:pPr>
-      <w:r>
-        <w:drawing>
-          <wp:inline xmlns:a="http://schemas.openxmlformats.org/drawingml/2006/main" xmlns:pic="http://schemas.openxmlformats.org/drawingml/2006/picture">
-            <wp:extent cx="5852160" cy="5093208"/>
-            <wp:docPr id="11" name="Picture 11"/>
-            <wp:cNvGraphicFramePr>
-              <a:graphicFrameLocks noChangeAspect="1"/>
-            </wp:cNvGraphicFramePr>
-            <a:graphic>
-              <a:graphicData uri="http://schemas.openxmlformats.org/drawingml/2006/picture">
-                <pic:pic>
-                  <pic:nvPicPr>
-                    <pic:cNvPr id="0" name="S11.png"/>
-                    <pic:cNvPicPr/>
-                  </pic:nvPicPr>
-                  <pic:blipFill>
-                    <a:blip r:embed="rId19"/>
-                    <a:stretch>
-                      <a:fillRect/>
-                    </a:stretch>
-                  </pic:blipFill>
-                  <pic:spPr>
-                    <a:xfrm>
-                      <a:off x="0" y="0"/>
-                      <a:ext cx="5852160" cy="5093208"/>
-                    </a:xfrm>
-                    <a:prstGeom prst="rect"/>
-                  </pic:spPr>
-                </pic:pic>
-              </a:graphicData>
-            </a:graphic>
-          </wp:inline>
-        </w:drawing>
-      </w:r>
+      <w:r/>
     </w:p>
     <w:p>
       <w:pPr>
@@ -1508,56 +1104,21 @@
         <w:rPr>
           <w:b/>
         </w:rPr>
-        <w:t xml:space="preserve">Subtype-stratified survival. </w:t>
+        <w:t xml:space="preserve">Location-stratified Kaplan–Meier curves. </w:t>
       </w:r>
       <w:r>
-        <w:t>(A) Kaplan–Meier curves by ecotype in the two adequately sized strata: DMG, H3 K27-altered (n = 140, log-rank P = 0.140) and pediatric high-grade glioma, H3/IDH-wildtype (n = 82, P = 0.0612). (B) Within-subtype Cox hazard ratios for Immune-desert versus Lymphocyte-inflamed, with the interaction likelihood-ratio test. Strata with very small ecotype-specific sample and event counts are descriptive only and are not evidence of subtype generalizability. Model output is in Supplementary Table S20.</w:t>
+        <w:t>Overall survival by ecotype within the midline, hemispheric, posterior-fossa and multi-compartment/ambiguous or other location classes. Colors follow the study-wide blue, red and gray palette; sparse panels are descriptive.</w:t>
       </w:r>
     </w:p>
     <w:p>
-      <w:r>
-        <w:br w:type="page"/>
-      </w:r>
+      <w:r/>
     </w:p>
     <w:p>
       <w:pPr>
         <w:spacing w:after="120"/>
         <w:jc w:val="center"/>
       </w:pPr>
-      <w:r>
-        <w:drawing>
-          <wp:inline xmlns:a="http://schemas.openxmlformats.org/drawingml/2006/main" xmlns:pic="http://schemas.openxmlformats.org/drawingml/2006/picture">
-            <wp:extent cx="5852160" cy="1440180"/>
-            <wp:docPr id="12" name="Picture 12"/>
-            <wp:cNvGraphicFramePr>
-              <a:graphicFrameLocks noChangeAspect="1"/>
-            </wp:cNvGraphicFramePr>
-            <a:graphic>
-              <a:graphicData uri="http://schemas.openxmlformats.org/drawingml/2006/picture">
-                <pic:pic>
-                  <pic:nvPicPr>
-                    <pic:cNvPr id="0" name="S12.png"/>
-                    <pic:cNvPicPr/>
-                  </pic:nvPicPr>
-                  <pic:blipFill>
-                    <a:blip r:embed="rId20"/>
-                    <a:stretch>
-                      <a:fillRect/>
-                    </a:stretch>
-                  </pic:blipFill>
-                  <pic:spPr>
-                    <a:xfrm>
-                      <a:off x="0" y="0"/>
-                      <a:ext cx="5852160" cy="1440180"/>
-                    </a:xfrm>
-                    <a:prstGeom prst="rect"/>
-                  </pic:spPr>
-                </pic:pic>
-              </a:graphicData>
-            </a:graphic>
-          </wp:inline>
-        </w:drawing>
-      </w:r>
+      <w:r/>
     </w:p>
     <w:p>
       <w:pPr>
@@ -1573,56 +1134,21 @@
         <w:rPr>
           <w:b/>
         </w:rPr>
-        <w:t xml:space="preserve">Location-stratified Kaplan–Meier curves. </w:t>
+        <w:t xml:space="preserve">Proportional-hazards diagnostics. </w:t>
       </w:r>
       <w:r>
-        <w:t>Overall survival by ecotype within the midline, hemispheric, posterior-fossa and multi-compartment/ambiguous or other location classes. Colors follow the study-wide blue, red and gray palette; sparse panels are descriptive.</w:t>
+        <w:t>Scaled Schoenfeld residuals against event-time rank for every covariate of the baseline multivariable Cox model (n = 251, 208 events). Red line, linear fit; blue dashed line, the fitted coefficient. Per-covariate Grambsch–Therneau χ² and P are shown above each panel; the global test is χ² = 9.49, df = 7, P = 0.219. Only DHG, H3 G34-mutant was nominally non-proportional (P = 0.021), which does not survive Benjamini–Hochberg correction across the seven covariates (q = 0.147). Full output is in Supplementary Table S20.</w:t>
       </w:r>
     </w:p>
     <w:p>
-      <w:r>
-        <w:br w:type="page"/>
-      </w:r>
+      <w:r/>
     </w:p>
     <w:p>
       <w:pPr>
         <w:spacing w:after="120"/>
         <w:jc w:val="center"/>
       </w:pPr>
-      <w:r>
-        <w:drawing>
-          <wp:inline xmlns:a="http://schemas.openxmlformats.org/drawingml/2006/main" xmlns:pic="http://schemas.openxmlformats.org/drawingml/2006/picture">
-            <wp:extent cx="5852160" cy="2221992"/>
-            <wp:docPr id="13" name="Picture 13"/>
-            <wp:cNvGraphicFramePr>
-              <a:graphicFrameLocks noChangeAspect="1"/>
-            </wp:cNvGraphicFramePr>
-            <a:graphic>
-              <a:graphicData uri="http://schemas.openxmlformats.org/drawingml/2006/picture">
-                <pic:pic>
-                  <pic:nvPicPr>
-                    <pic:cNvPr id="0" name="S13.png"/>
-                    <pic:cNvPicPr/>
-                  </pic:nvPicPr>
-                  <pic:blipFill>
-                    <a:blip r:embed="rId21"/>
-                    <a:stretch>
-                      <a:fillRect/>
-                    </a:stretch>
-                  </pic:blipFill>
-                  <pic:spPr>
-                    <a:xfrm>
-                      <a:off x="0" y="0"/>
-                      <a:ext cx="5852160" cy="2221992"/>
-                    </a:xfrm>
-                    <a:prstGeom prst="rect"/>
-                  </pic:spPr>
-                </pic:pic>
-              </a:graphicData>
-            </a:graphic>
-          </wp:inline>
-        </w:drawing>
-      </w:r>
+      <w:r/>
     </w:p>
     <w:p>
       <w:pPr>
@@ -1638,56 +1164,21 @@
         <w:rPr>
           <w:b/>
         </w:rPr>
-        <w:t xml:space="preserve">Proportional-hazards diagnostics. </w:t>
+        <w:t xml:space="preserve">Survival missingness and inverse-probability-weighting sensitivity. </w:t>
       </w:r>
       <w:r>
-        <w:t>Scaled Schoenfeld residuals against event-time rank for every covariate of the baseline multivariable Cox model (n = 251, 208 events). Red line, linear fit; blue dashed line, the fitted coefficient. Per-covariate Grambsch–Therneau χ² and P are shown above each panel; the global test is χ² = 9.49, df = 7, P = 0.219. Only DHG, H3 G34-mutant was nominally non-proportional (P = 0.021), which does not survive Benjamini–Hochberg correction across the seven covariates (q = 0.147). Full output is in Supplementary Table S20.</w:t>
+        <w:t>(A) Proportion of tumors with overall-survival annotation by integrated molecular group. (B) Trimmed stabilized weights (mean 1.15, range 0.76–5.79). (C) Hazard-ratio estimates across the weighting schemes. (D) Covariate balance before and after weighting. Overall survival was evaluable for 251 of 349 tumors (71.9%); missingness is differential with respect to the measured confounders and non-differential with respect to immune ecotype (χ² = 1.54, df = 2, P = 0.463). The analysis conditions on measured covariates; a missing-not-at-random mechanism cannot be excluded and is stated in the limitations. Statistics are in Supplementary Table S21.</w:t>
       </w:r>
     </w:p>
     <w:p>
-      <w:r>
-        <w:br w:type="page"/>
-      </w:r>
+      <w:r/>
     </w:p>
     <w:p>
       <w:pPr>
         <w:spacing w:after="120"/>
         <w:jc w:val="center"/>
       </w:pPr>
-      <w:r>
-        <w:drawing>
-          <wp:inline xmlns:a="http://schemas.openxmlformats.org/drawingml/2006/main" xmlns:pic="http://schemas.openxmlformats.org/drawingml/2006/picture">
-            <wp:extent cx="5852159" cy="3250691"/>
-            <wp:docPr id="14" name="Picture 14"/>
-            <wp:cNvGraphicFramePr>
-              <a:graphicFrameLocks noChangeAspect="1"/>
-            </wp:cNvGraphicFramePr>
-            <a:graphic>
-              <a:graphicData uri="http://schemas.openxmlformats.org/drawingml/2006/picture">
-                <pic:pic>
-                  <pic:nvPicPr>
-                    <pic:cNvPr id="0" name="S14.png"/>
-                    <pic:cNvPicPr/>
-                  </pic:nvPicPr>
-                  <pic:blipFill>
-                    <a:blip r:embed="rId22"/>
-                    <a:stretch>
-                      <a:fillRect/>
-                    </a:stretch>
-                  </pic:blipFill>
-                  <pic:spPr>
-                    <a:xfrm>
-                      <a:off x="0" y="0"/>
-                      <a:ext cx="5852159" cy="3250691"/>
-                    </a:xfrm>
-                    <a:prstGeom prst="rect"/>
-                  </pic:spPr>
-                </pic:pic>
-              </a:graphicData>
-            </a:graphic>
-          </wp:inline>
-        </w:drawing>
-      </w:r>
+      <w:r/>
     </w:p>
     <w:p>
       <w:pPr>
@@ -1703,56 +1194,21 @@
         <w:rPr>
           <w:b/>
         </w:rPr>
-        <w:t xml:space="preserve">Survival missingness and inverse-probability-weighting sensitivity. </w:t>
+        <w:t xml:space="preserve">Single-cell support for the cellular interpretation of the immune signatures and of the ecotype axis, full analysis. </w:t>
       </w:r>
       <w:r>
-        <w:t>(A) Proportion of tumors with overall-survival annotation by integrated molecular group. (B) Trimmed stabilized weights (mean 1.15, range 0.76–5.79). (C) Hazard-ratio estimates across the weighting schemes. (D) Covariate balance before and after weighting. Overall survival was evaluable for 251 of 349 tumors (71.9%); missingness is differential with respect to the measured confounders and non-differential with respect to immune ecotype (χ² = 1.54, df = 2, P = 0.463). The analysis conditions on measured covariates; a missing-not-at-random mechanism cannot be excluded and is stated in the limitations. Statistics are in Supplementary Table S21.</w:t>
+        <w:t>(A) Mean z-score of each of the 24 brain-tuned signatures by annotated cell type in 18,619 immune cells from four pediatric high-grade gliomas (GSE227983; H3 K27-altered n = 1, H3-wildtype hemispheric n = 3; posterior fossa ependymoma excluded). Scores are control-gene-matched, using 25 expression bins and 50 control genes per signature gene. Cell annotations are those published by the original authors and were verified here against canonical lineage markers. The red outline marks Glioma_Inflammatory_Wang2017. (B) Area under the receiver-operating-characteristic curve for each directional signature in identifying the cell type it is named for; bars across all cells, whiskers the per-sample range (also shown as Figure 5A). (C) Glioma_Inflammatory_Wang2017 by cell type; it identifies T cells rather than myeloid cells (AUROC 0.075 for myeloid identity). (D) Cell type expressing each of the 246 detectable genes defining the Lymphocyte-inflamed versus Immune-desert contrast, in matched Smart-seq2 immune and malignant cells compared on one platform. (E) Percentage of those genes attributed to immune cells against 200 draws of expression-matched random genes (permutation P = 0.005). The signatures and the ecotype axis are immune-cell-associated, with many genes preferentially expressed in myeloid cells. Statistics are in Supplementary Tables S22 and S23.</w:t>
       </w:r>
     </w:p>
     <w:p>
-      <w:r>
-        <w:br w:type="page"/>
-      </w:r>
+      <w:r/>
     </w:p>
     <w:p>
       <w:pPr>
         <w:spacing w:after="120"/>
         <w:jc w:val="center"/>
       </w:pPr>
-      <w:r>
-        <w:drawing>
-          <wp:inline xmlns:a="http://schemas.openxmlformats.org/drawingml/2006/main" xmlns:pic="http://schemas.openxmlformats.org/drawingml/2006/picture">
-            <wp:extent cx="5852160" cy="3602736"/>
-            <wp:docPr id="15" name="Picture 15"/>
-            <wp:cNvGraphicFramePr>
-              <a:graphicFrameLocks noChangeAspect="1"/>
-            </wp:cNvGraphicFramePr>
-            <a:graphic>
-              <a:graphicData uri="http://schemas.openxmlformats.org/drawingml/2006/picture">
-                <pic:pic>
-                  <pic:nvPicPr>
-                    <pic:cNvPr id="0" name="S15.png"/>
-                    <pic:cNvPicPr/>
-                  </pic:nvPicPr>
-                  <pic:blipFill>
-                    <a:blip r:embed="rId23"/>
-                    <a:stretch>
-                      <a:fillRect/>
-                    </a:stretch>
-                  </pic:blipFill>
-                  <pic:spPr>
-                    <a:xfrm>
-                      <a:off x="0" y="0"/>
-                      <a:ext cx="5852160" cy="3602736"/>
-                    </a:xfrm>
-                    <a:prstGeom prst="rect"/>
-                  </pic:spPr>
-                </pic:pic>
-              </a:graphicData>
-            </a:graphic>
-          </wp:inline>
-        </w:drawing>
-      </w:r>
+      <w:r/>
     </w:p>
     <w:p>
       <w:pPr>
@@ -1768,81 +1224,14 @@
         <w:rPr>
           <w:b/>
         </w:rPr>
-        <w:t xml:space="preserve">Single-cell support for the cellular interpretation of the immune signatures and of the ecotype axis, full analysis. </w:t>
+        <w:t xml:space="preserve">Spatial organization of the immune programs in H3.3 K27M pediatric diffuse midline glioma, full analysis. </w:t>
       </w:r>
       <w:r>
-        <w:t>(A) Mean z-score of each of the 24 brain-tuned signatures by annotated cell type in 18,619 immune cells from four pediatric high-grade gliomas (GSE227983; H3 K27-altered n = 1, H3-wildtype hemispheric n = 3; posterior fossa ependymoma excluded). Scores are control-gene-matched, using 25 expression bins and 50 control genes per signature gene. Cell annotations are those published by the original authors and were verified here against canonical lineage markers. The red outline marks Glioma_Inflammatory_Wang2017. (B) Area under the receiver-operating-characteristic curve for each directional signature in identifying the cell type it is named for; bars across all cells, whiskers the per-sample range (also shown as Figure 5A). (C) Glioma_Inflammatory_Wang2017 by cell type; it identifies T cells rather than myeloid cells (AUROC 0.075 for myeloid identity). (D) Cell type expressing each of the 246 detectable genes defining the Lymphocyte-inflamed versus Immune-desert contrast, in matched Smart-seq2 immune and malignant cells compared on one platform. (E) Percentage of those genes attributed to immune cells against 200 draws of expression-matched random genes (permutation P = 0.005). The signatures and the ecotype axis are immune-cell-associated, with many genes preferentially expressed in myeloid cells. Statistics are in Supplementary Tables S22 and S23.</w:t>
+        <w:t>Three H3.3 K27M pediatric diffuse midline glioma sections profiled by 10x Visium (GSE268577). In-tissue spots were normalized to counts per 10,000, log₂-transformed and scored with the same control-gene-matched method used for the single-cell data; spots are unsorted, so cell composition is meaningful in this dataset. (A–C) Each in-tissue spot colored by the bulk ecotype centroid it maps most closely to, assigned by Pearson correlation across the 24 brain-tuned signatures after z-scoring within dataset; Sample-1 (577 spots), Sample-2 (856) and Sample-3 (217). Neighboring spots share an assignment more often than chance in all three sections: 0.540, 0.357 and 0.562 against permutation nulls of 0.358, 0.338 and 0.370 (999 label permutations; P = 0.001, 0.019 and 0.001). Spots mapping most closely to each of the three bulk ecotype centroids were represented within each section, which suggests that a bulk ecotype label summarizes heterogeneous regional immune programs within a specimen. (D) Moran’s I on the hexagonal first-order neighbor graph for the twelve signatures with the highest mean value across sections; 999 permutations per signature. Ten of the 24 signatures are spatially autocorrelated at a false-discovery rate below 0.05 in all three sections, most strongly the myeloid and antigen-presentation programs. (E) Correlation between the myeloid and lymphoid theme composites, in the bulk cohort and per spot within each section. The close coupling seen across bulk tumors (r = 0.80) is weaker within tissue (r = 0.36, 0.05 and 0.48), consistent with an aggregation contribution. (F) Proportion of in-tissue spots assigned to each ecotype per section. Statistics are in Supplementary Tables S22 and S24.</w:t>
       </w:r>
     </w:p>
     <w:p>
-      <w:r>
-        <w:br w:type="page"/>
-      </w:r>
-    </w:p>
-    <w:p>
-      <w:pPr>
-        <w:spacing w:after="120"/>
-        <w:jc w:val="center"/>
-      </w:pPr>
-      <w:r>
-        <w:drawing>
-          <wp:inline xmlns:a="http://schemas.openxmlformats.org/drawingml/2006/main" xmlns:pic="http://schemas.openxmlformats.org/drawingml/2006/picture">
-            <wp:extent cx="5852160" cy="3044952"/>
-            <wp:docPr id="16" name="Picture 16"/>
-            <wp:cNvGraphicFramePr>
-              <a:graphicFrameLocks noChangeAspect="1"/>
-            </wp:cNvGraphicFramePr>
-            <a:graphic>
-              <a:graphicData uri="http://schemas.openxmlformats.org/drawingml/2006/picture">
-                <pic:pic>
-                  <pic:nvPicPr>
-                    <pic:cNvPr id="0" name="S16.png"/>
-                    <pic:cNvPicPr/>
-                  </pic:nvPicPr>
-                  <pic:blipFill>
-                    <a:blip r:embed="rId24"/>
-                    <a:stretch>
-                      <a:fillRect/>
-                    </a:stretch>
-                  </pic:blipFill>
-                  <pic:spPr>
-                    <a:xfrm>
-                      <a:off x="0" y="0"/>
-                      <a:ext cx="5852160" cy="3044952"/>
-                    </a:xfrm>
-                    <a:prstGeom prst="rect"/>
-                  </pic:spPr>
-                </pic:pic>
-              </a:graphicData>
-            </a:graphic>
-          </wp:inline>
-        </w:drawing>
-      </w:r>
-    </w:p>
-    <w:p>
-      <w:pPr>
-        <w:spacing w:after="220" w:line="276" w:lineRule="auto"/>
-      </w:pPr>
-      <w:r>
-        <w:rPr>
-          <w:b/>
-        </w:rPr>
-        <w:t xml:space="preserve">Figure S16. </w:t>
-      </w:r>
-      <w:r>
-        <w:rPr>
-          <w:b/>
-        </w:rPr>
-        <w:t xml:space="preserve">Spatial organization of the immune programs in H3.3 K27M pediatric diffuse midline glioma, full analysis. </w:t>
-      </w:r>
-      <w:r>
-        <w:t>Three H3.3 K27M pediatric diffuse midline glioma sections profiled by 10x Visium (GSE268577). In-tissue spots were normalized to counts per 10,000, log₂-transformed and scored with the same control-gene-matched method used for the single-cell data; spots are unsorted, so cell composition is meaningful in this dataset. (A–C) Each in-tissue spot colored by the bulk ecotype centroid it maps most closely to, assigned by Pearson correlation across the 24 brain-tuned signatures after z-scoring within dataset; Sample-1 (577 spots), Sample-2 (856) and Sample-3 (217). Neighboring spots share an assignment more often than chance in all three sections: 0.540, 0.357 and 0.562 against permutation nulls of 0.358, 0.338 and 0.370 (999 label permutations; P = 0.001, 0.019 and 0.001). Spots mapping most closely to each of the three bulk ecotype centroids were represented within each section, so a bulk ecotype label reflects a spatial average over regions of a specimen rather than a property of a whole tumor. (D) Moran’s I on the hexagonal first-order neighbor graph for the twelve signatures with the highest mean value across sections; 999 permutations per signature. Ten of the 24 signatures are spatially autocorrelated at a false-discovery rate below 0.05 in all three sections, most strongly the myeloid and antigen-presentation programs. (E) Correlation between the myeloid and lymphoid theme composites, in the bulk cohort and per spot within each section. The close coupling seen across bulk tumors (r = 0.80) is weaker within tissue (r = 0.36, 0.05 and 0.48), consistent with an aggregation contribution. (F) Proportion of in-tissue spots assigned to each ecotype per section. Sample-2 is the weakest section across every analysis. Statistics are in Supplementary Tables S22 and S24.</w:t>
-      </w:r>
-    </w:p>
-    <w:p>
-      <w:r>
-        <w:br w:type="page"/>
-      </w:r>
+      <w:r/>
     </w:p>
     <w:p>
       <w:pPr>
@@ -2146,7 +1535,7 @@
         <w:t xml:space="preserve">Kruskal-Wallis tests of the immune features and theme composites. </w:t>
       </w:r>
       <w:r>
-        <w:t>Per-feature and per-theme Kruskal-Wallis tests across the three ecotypes with Benjamini-Hochberg adjustment. Supports: Figures S7, S8.</w:t>
+        <w:t>Per-feature and per-theme Kruskal-Wallis tests across the three ecotypes with Benjamini-Hochberg adjustment. Supports: Figures S6, S7.</w:t>
       </w:r>
     </w:p>
     <w:p>
@@ -2166,7 +1555,7 @@
         <w:t xml:space="preserve">Dunn post-hoc comparisons. </w:t>
       </w:r>
       <w:r>
-        <w:t>Pairwise Dunn comparisons for every feature, with within-feature Benjamini-Hochberg adjustment. Supports: Figure S8.</w:t>
+        <w:t>Pairwise Dunn comparisons for every feature, with within-feature Benjamini-Hochberg adjustment. Supports: Figure S7.</w:t>
       </w:r>
     </w:p>
     <w:p>
@@ -2246,7 +1635,7 @@
         <w:t xml:space="preserve">Pathway enrichment from the adjusted gene lists. </w:t>
       </w:r>
       <w:r>
-        <w:t>g:Profiler enrichment of the molecular-group-adjusted up-regulated gene lists. Supports: Figure S9.</w:t>
+        <w:t>g:Profiler enrichment of the molecular-group-adjusted up-regulated gene lists. Supports: Figure S8.</w:t>
       </w:r>
     </w:p>
     <w:p>
@@ -2266,7 +1655,7 @@
         <w:t xml:space="preserve">Cox models and proportional-hazards diagnostics. </w:t>
       </w:r>
       <w:r>
-        <w:t>Multivariable Cox models, Grambsch-Therneau tests on scaled Schoenfeld residuals, and the comparison with and without location adjustment. Supports: Figure 7B; Figures S11, S13.</w:t>
+        <w:t>Multivariable Cox models, Grambsch-Therneau tests on scaled Schoenfeld residuals, and the comparison with and without location adjustment. Supports: Figure 7B; Figures S10, S12.</w:t>
       </w:r>
     </w:p>
     <w:p>
@@ -2286,7 +1675,7 @@
         <w:t xml:space="preserve">Survival evaluability and missingness. </w:t>
       </w:r>
       <w:r>
-        <w:t>Survival evaluability by baseline characteristic and ecotype by evaluability within each molecular group. Supports: Figure S14.</w:t>
+        <w:t>Survival evaluability by baseline characteristic and ecotype by evaluability within each molecular group. Supports: Figure S13.</w:t>
       </w:r>
     </w:p>
     <w:p>
@@ -2306,7 +1695,7 @@
         <w:t xml:space="preserve">Single-cell signature attribution. </w:t>
       </w:r>
       <w:r>
-        <w:t>AUROC of each directional signature for the cell type it is named for, and the effect of correcting the two misassigned theme memberships. Supports: Figure 5A; Figure S15.</w:t>
+        <w:t>AUROC of each directional signature for the cell type it is named for, and the effect of correcting the two misassigned theme memberships. Supports: Figure 5A; Figure S14.</w:t>
       </w:r>
     </w:p>
     <w:p>
@@ -2326,7 +1715,7 @@
         <w:t xml:space="preserve">Cell type expressing the ecotype-axis genes. </w:t>
       </w:r>
       <w:r>
-        <w:t>Mean expression and detection rate of each detectable ecotype-axis gene in matched malignant, myeloid and T cells. Supports: Figure 5B; Figure S15.</w:t>
+        <w:t>Mean expression and detection rate of each detectable ecotype-axis gene in matched malignant, myeloid and T cells. Supports: Figure 5B; Figure S14.</w:t>
       </w:r>
     </w:p>
     <w:p>
@@ -2346,7 +1735,7 @@
         <w:t xml:space="preserve">Spatial autocorrelation and spot-level ecotype assignment. </w:t>
       </w:r>
       <w:r>
-        <w:t>Moran's I for every signature in each section, and the spot-level assignment and spatial coherence statistics. Supports: Figure 5C-E; Figure S16.</w:t>
+        <w:t>Moran's I for every signature in each section, and the spot-level assignment and spatial coherence statistics. Supports: Figure 5C-E; Figure S15.</w:t>
       </w:r>
     </w:p>
     <w:p>
@@ -2367,166 +1756,6 @@
       </w:r>
       <w:r>
         <w:t>Execution environment, package versions, parameters and seeds for every analysis. Supports: Methods.</w:t>
-      </w:r>
-    </w:p>
-    <w:p>
-      <w:pPr>
-        <w:spacing w:before="280" w:after="120"/>
-      </w:pPr>
-      <w:r>
-        <w:rPr>
-          <w:b/>
-          <w:sz w:val="26"/>
-        </w:rPr>
-        <w:t>Items deposited in the study repository</w:t>
-      </w:r>
-    </w:p>
-    <w:p>
-      <w:pPr>
-        <w:spacing w:after="160"/>
-      </w:pPr>
-      <w:r>
-        <w:rPr>
-          <w:i w:val="0"/>
-          <w:color w:val="404040"/>
-          <w:sz w:val="20"/>
-        </w:rPr>
-        <w:t>The following analyses were part of the earlier revision package and are not included in this submission. They are deposited, with the code and the executed notebooks that produce them, at https://github.com/paperhwi/pediatric_glioma_immuneprofiling.</w:t>
-      </w:r>
-    </w:p>
-    <w:p>
-      <w:pPr>
-        <w:pStyle w:val="ListBullet"/>
-        <w:spacing w:after="60"/>
-      </w:pPr>
-      <w:r>
-        <w:rPr>
-          <w:b/>
-        </w:rPr>
-        <w:t xml:space="preserve">Supplementary Figures S1, S2 and S7A–C (previous numbering) — </w:t>
-      </w:r>
-      <w:r>
-        <w:t>same-resource pooled n = 702 cross-method concordance, consensus heatmap and re-clustering sensitivity</w:t>
-      </w:r>
-    </w:p>
-    <w:p>
-      <w:pPr>
-        <w:pStyle w:val="ListBullet"/>
-        <w:spacing w:after="60"/>
-      </w:pPr>
-      <w:r>
-        <w:rPr>
-          <w:b/>
-        </w:rPr>
-        <w:t xml:space="preserve">Supplementary Figure S14A–C (previous numbering) — </w:t>
-      </w:r>
-      <w:r>
-        <w:t>same-resource BRAF/RTK-altered cohort-family projection and pathway-score sensitivity</w:t>
-      </w:r>
-    </w:p>
-    <w:p>
-      <w:pPr>
-        <w:pStyle w:val="ListBullet"/>
-        <w:spacing w:after="60"/>
-      </w:pPr>
-      <w:r>
-        <w:rPr>
-          <w:b/>
-        </w:rPr>
-        <w:t xml:space="preserve">Supplementary Figure S15 (previous numbering) — </w:t>
-      </w:r>
-      <w:r>
-        <w:t>immune-checkpoint-related transcript expression by ecotype</w:t>
-      </w:r>
-    </w:p>
-    <w:p>
-      <w:pPr>
-        <w:pStyle w:val="ListBullet"/>
-        <w:spacing w:after="60"/>
-      </w:pPr>
-      <w:r>
-        <w:rPr>
-          <w:b/>
-        </w:rPr>
-        <w:t xml:space="preserve">Supplementary Figure S16 (previous numbering) — </w:t>
-      </w:r>
-      <w:r>
-        <w:t>CAR-T target-related transcript expression by ecotype</w:t>
-      </w:r>
-    </w:p>
-    <w:p>
-      <w:pPr>
-        <w:pStyle w:val="ListBullet"/>
-        <w:spacing w:after="60"/>
-      </w:pPr>
-      <w:r>
-        <w:rPr>
-          <w:b/>
-        </w:rPr>
-        <w:t xml:space="preserve">Supplementary Figure S17 (previous numbering) — </w:t>
-      </w:r>
-      <w:r>
-        <w:t>audit copy of the molecular-group-adjusted differential-expression analysis</w:t>
-      </w:r>
-    </w:p>
-    <w:p>
-      <w:pPr>
-        <w:pStyle w:val="ListBullet"/>
-        <w:spacing w:after="60"/>
-      </w:pPr>
-      <w:r>
-        <w:rPr>
-          <w:b/>
-        </w:rPr>
-        <w:t xml:space="preserve">Supplementary Figure S18 (previous numbering) — </w:t>
-      </w:r>
-      <w:r>
-        <w:t>Kaplan–Meier curves for the very small DHG, H3 G34-mutant and infant-type hemispheric strata</w:t>
-      </w:r>
-    </w:p>
-    <w:p>
-      <w:pPr>
-        <w:pStyle w:val="ListBullet"/>
-        <w:spacing w:after="60"/>
-      </w:pPr>
-      <w:r>
-        <w:rPr>
-          <w:b/>
-        </w:rPr>
-        <w:t xml:space="preserve">Supplementary Figure S19 and Tables S20–S23 (revision numbering) — </w:t>
-      </w:r>
-      <w:r>
-        <w:t>hematopoietic stem and progenitor programs across the ecotypes</w:t>
-      </w:r>
-    </w:p>
-    <w:p>
-      <w:pPr>
-        <w:pStyle w:val="ListBullet"/>
-        <w:spacing w:after="60"/>
-      </w:pPr>
-      <w:r>
-        <w:rPr>
-          <w:b/>
-        </w:rPr>
-        <w:t xml:space="preserve">Supplementary Figure S10A (previous numbering) — </w:t>
-      </w:r>
-      <w:r>
-        <w:t>subtype-stratified Kaplan–Meier curves including the very small strata</w:t>
-      </w:r>
-    </w:p>
-    <w:p>
-      <w:pPr>
-        <w:pStyle w:val="ListBullet"/>
-        <w:spacing w:after="60"/>
-      </w:pPr>
-      <w:r>
-        <w:rPr>
-          <w:b/>
-        </w:rPr>
-        <w:t xml:space="preserve">Supplementary Tables S1 and S11 (previous numbering) — </w:t>
-      </w:r>
-      <w:r>
-        <w:t>auxiliary molecular alteration flags, and the Table 1 ecotype rows and contingency counts</w:t>
       </w:r>
     </w:p>
     <w:p>

</xml_diff>